<commit_message>
Méthodologie agile : Kanban, backlog et adaptation au projet solo
- Mémoire : section 2.1.4 (adaptation de l'agile à un projet individuel,
  rôles endossés, Definition of Done, rétrospective).
- docs/BACKLOG.md : product backlog (16 User Stories, MoSCoW, story points).
- docs/kanban.html : tableau Kanban visuel (à capturer pour le dossier).
- scripts/creer-issues-github.sh : création des issues + labels Kanban via gh.
</commit_message>
<xml_diff>
--- a/livrables/Dossier_Projet_CongesFlow.docx
+++ b/livrables/Dossier_Projet_CongesFlow.docx
@@ -4571,6 +4571,982 @@
         <w:t xml:space="preserve">Le suivi des tâches a été assuré par un tableau Kanban (colonnes À faire / En cours / En revue / Terminé). Le versionnement du code a suivi une stratégie de branches (voir chapitre 3) et chaque incrément a été validé par l'exécution automatique des tests via l'intégration continue.</w:t>
       </w:r>
     </w:p>
+    <w:p>
+      <w:pPr>
+        <w:pStyle w:val="Heading3"/>
+      </w:pPr>
+      <w:r>
+        <w:t xml:space="preserve">2.1.4 Adaptation de la méthode agile à un projet individuel</w:t>
+      </w:r>
+    </w:p>
+    <w:p>
+      <w:pPr>
+        <w:spacing w:after="120"/>
+      </w:pPr>
+      <w:r>
+        <w:t xml:space="preserve">Le projet ayant été mené seul, la méthode agile a été adaptée : il s'agit d'une approche « Scrumban » (un Scrum allégé, piloté au quotidien par un tableau Kanban). J'ai endossé l'ensemble des rôles et remplacé les cérémonies collectives par des équivalents adaptés au travail individuel. Assumer cette adaptation fait partie de la démarche : elle démontre la compréhension des principes agiles autant que leur mise en œuvre.</w:t>
+      </w:r>
+    </w:p>
+    <w:p>
+      <w:pPr>
+        <w:spacing w:after="120"/>
+        <w:rPr>
+          <w:b/>
+          <w:bCs/>
+        </w:rPr>
+      </w:pPr>
+      <w:r>
+        <w:rPr>
+          <w:b/>
+          <w:bCs/>
+        </w:rPr>
+        <w:t xml:space="preserve">Rôles endossés :</w:t>
+      </w:r>
+    </w:p>
+    <w:tbl>
+      <w:tblPr>
+        <w:tblW w:type="dxa" w:w="9026"/>
+        <w:tblBorders>
+          <w:top w:val="single" w:color="auto" w:sz="4"/>
+          <w:left w:val="single" w:color="auto" w:sz="4"/>
+          <w:bottom w:val="single" w:color="auto" w:sz="4"/>
+          <w:right w:val="single" w:color="auto" w:sz="4"/>
+          <w:insideH w:val="single" w:color="auto" w:sz="4"/>
+          <w:insideV w:val="single" w:color="auto" w:sz="4"/>
+        </w:tblBorders>
+      </w:tblPr>
+      <w:tblGrid>
+        <w:gridCol w:w="2300"/>
+        <w:gridCol w:w="1900"/>
+        <w:gridCol w:w="4826"/>
+      </w:tblGrid>
+      <w:tr>
+        <w:trPr>
+          <w:tblHeader/>
+        </w:trPr>
+        <w:tc>
+          <w:tcPr>
+            <w:tcW w:type="dxa" w:w="2300"/>
+            <w:tcBorders>
+              <w:top w:val="single" w:color="B7C3D0" w:sz="1"/>
+              <w:left w:val="single" w:color="B7C3D0" w:sz="1"/>
+              <w:bottom w:val="single" w:color="B7C3D0" w:sz="1"/>
+              <w:right w:val="single" w:color="B7C3D0" w:sz="1"/>
+            </w:tcBorders>
+            <w:shd w:fill="0B5394" w:val="clear"/>
+            <w:tcMar>
+              <w:top w:type="dxa" w:w="80"/>
+              <w:left w:type="dxa" w:w="110"/>
+              <w:bottom w:type="dxa" w:w="80"/>
+              <w:right w:type="dxa" w:w="110"/>
+            </w:tcMar>
+          </w:tcPr>
+          <w:p>
+            <w:r>
+              <w:rPr>
+                <w:b/>
+                <w:bCs/>
+                <w:color w:val="FFFFFF"/>
+                <w:sz w:val="19"/>
+                <w:szCs w:val="19"/>
+              </w:rPr>
+              <w:t xml:space="preserve">Rôle Scrum</w:t>
+            </w:r>
+          </w:p>
+        </w:tc>
+        <w:tc>
+          <w:tcPr>
+            <w:tcW w:type="dxa" w:w="1900"/>
+            <w:tcBorders>
+              <w:top w:val="single" w:color="B7C3D0" w:sz="1"/>
+              <w:left w:val="single" w:color="B7C3D0" w:sz="1"/>
+              <w:bottom w:val="single" w:color="B7C3D0" w:sz="1"/>
+              <w:right w:val="single" w:color="B7C3D0" w:sz="1"/>
+            </w:tcBorders>
+            <w:shd w:fill="0B5394" w:val="clear"/>
+            <w:tcMar>
+              <w:top w:type="dxa" w:w="80"/>
+              <w:left w:type="dxa" w:w="110"/>
+              <w:bottom w:type="dxa" w:w="80"/>
+              <w:right w:type="dxa" w:w="110"/>
+            </w:tcMar>
+          </w:tcPr>
+          <w:p>
+            <w:r>
+              <w:rPr>
+                <w:b/>
+                <w:bCs/>
+                <w:color w:val="FFFFFF"/>
+                <w:sz w:val="19"/>
+                <w:szCs w:val="19"/>
+              </w:rPr>
+              <w:t xml:space="preserve">Assuré par</w:t>
+            </w:r>
+          </w:p>
+        </w:tc>
+        <w:tc>
+          <w:tcPr>
+            <w:tcW w:type="dxa" w:w="4826"/>
+            <w:tcBorders>
+              <w:top w:val="single" w:color="B7C3D0" w:sz="1"/>
+              <w:left w:val="single" w:color="B7C3D0" w:sz="1"/>
+              <w:bottom w:val="single" w:color="B7C3D0" w:sz="1"/>
+              <w:right w:val="single" w:color="B7C3D0" w:sz="1"/>
+            </w:tcBorders>
+            <w:shd w:fill="0B5394" w:val="clear"/>
+            <w:tcMar>
+              <w:top w:type="dxa" w:w="80"/>
+              <w:left w:type="dxa" w:w="110"/>
+              <w:bottom w:type="dxa" w:w="80"/>
+              <w:right w:type="dxa" w:w="110"/>
+            </w:tcMar>
+          </w:tcPr>
+          <w:p>
+            <w:r>
+              <w:rPr>
+                <w:b/>
+                <w:bCs/>
+                <w:color w:val="FFFFFF"/>
+                <w:sz w:val="19"/>
+                <w:szCs w:val="19"/>
+              </w:rPr>
+              <w:t xml:space="preserve">En pratique sur le projet</w:t>
+            </w:r>
+          </w:p>
+        </w:tc>
+      </w:tr>
+      <w:tr>
+        <w:tc>
+          <w:tcPr>
+            <w:tcW w:type="dxa" w:w="2300"/>
+            <w:tcBorders>
+              <w:top w:val="single" w:color="B7C3D0" w:sz="1"/>
+              <w:left w:val="single" w:color="B7C3D0" w:sz="1"/>
+              <w:bottom w:val="single" w:color="B7C3D0" w:sz="1"/>
+              <w:right w:val="single" w:color="B7C3D0" w:sz="1"/>
+            </w:tcBorders>
+            <w:tcMar>
+              <w:top w:type="dxa" w:w="70"/>
+              <w:left w:type="dxa" w:w="110"/>
+              <w:bottom w:type="dxa" w:w="70"/>
+              <w:right w:type="dxa" w:w="110"/>
+            </w:tcMar>
+          </w:tcPr>
+          <w:p>
+            <w:r>
+              <w:rPr>
+                <w:sz w:val="18"/>
+                <w:szCs w:val="18"/>
+              </w:rPr>
+              <w:t xml:space="preserve">Product Owner</w:t>
+            </w:r>
+          </w:p>
+        </w:tc>
+        <w:tc>
+          <w:tcPr>
+            <w:tcW w:type="dxa" w:w="1900"/>
+            <w:tcBorders>
+              <w:top w:val="single" w:color="B7C3D0" w:sz="1"/>
+              <w:left w:val="single" w:color="B7C3D0" w:sz="1"/>
+              <w:bottom w:val="single" w:color="B7C3D0" w:sz="1"/>
+              <w:right w:val="single" w:color="B7C3D0" w:sz="1"/>
+            </w:tcBorders>
+            <w:tcMar>
+              <w:top w:type="dxa" w:w="70"/>
+              <w:left w:type="dxa" w:w="110"/>
+              <w:bottom w:type="dxa" w:w="70"/>
+              <w:right w:type="dxa" w:w="110"/>
+            </w:tcMar>
+          </w:tcPr>
+          <w:p>
+            <w:r>
+              <w:rPr>
+                <w:sz w:val="18"/>
+                <w:szCs w:val="18"/>
+              </w:rPr>
+              <w:t xml:space="preserve">Le candidat</w:t>
+            </w:r>
+          </w:p>
+        </w:tc>
+        <w:tc>
+          <w:tcPr>
+            <w:tcW w:type="dxa" w:w="4826"/>
+            <w:tcBorders>
+              <w:top w:val="single" w:color="B7C3D0" w:sz="1"/>
+              <w:left w:val="single" w:color="B7C3D0" w:sz="1"/>
+              <w:bottom w:val="single" w:color="B7C3D0" w:sz="1"/>
+              <w:right w:val="single" w:color="B7C3D0" w:sz="1"/>
+            </w:tcBorders>
+            <w:tcMar>
+              <w:top w:type="dxa" w:w="70"/>
+              <w:left w:type="dxa" w:w="110"/>
+              <w:bottom w:type="dxa" w:w="70"/>
+              <w:right w:type="dxa" w:w="110"/>
+            </w:tcMar>
+          </w:tcPr>
+          <w:p>
+            <w:r>
+              <w:rPr>
+                <w:sz w:val="18"/>
+                <w:szCs w:val="18"/>
+              </w:rPr>
+              <w:t xml:space="preserve">Rédaction et priorisation du backlog (MoSCoW), arbitrage du périmètre</w:t>
+            </w:r>
+          </w:p>
+        </w:tc>
+      </w:tr>
+      <w:tr>
+        <w:tc>
+          <w:tcPr>
+            <w:tcW w:type="dxa" w:w="2300"/>
+            <w:tcBorders>
+              <w:top w:val="single" w:color="B7C3D0" w:sz="1"/>
+              <w:left w:val="single" w:color="B7C3D0" w:sz="1"/>
+              <w:bottom w:val="single" w:color="B7C3D0" w:sz="1"/>
+              <w:right w:val="single" w:color="B7C3D0" w:sz="1"/>
+            </w:tcBorders>
+            <w:tcMar>
+              <w:top w:type="dxa" w:w="70"/>
+              <w:left w:type="dxa" w:w="110"/>
+              <w:bottom w:type="dxa" w:w="70"/>
+              <w:right w:type="dxa" w:w="110"/>
+            </w:tcMar>
+          </w:tcPr>
+          <w:p>
+            <w:r>
+              <w:rPr>
+                <w:sz w:val="18"/>
+                <w:szCs w:val="18"/>
+              </w:rPr>
+              <w:t xml:space="preserve">Scrum Master</w:t>
+            </w:r>
+          </w:p>
+        </w:tc>
+        <w:tc>
+          <w:tcPr>
+            <w:tcW w:type="dxa" w:w="1900"/>
+            <w:tcBorders>
+              <w:top w:val="single" w:color="B7C3D0" w:sz="1"/>
+              <w:left w:val="single" w:color="B7C3D0" w:sz="1"/>
+              <w:bottom w:val="single" w:color="B7C3D0" w:sz="1"/>
+              <w:right w:val="single" w:color="B7C3D0" w:sz="1"/>
+            </w:tcBorders>
+            <w:tcMar>
+              <w:top w:type="dxa" w:w="70"/>
+              <w:left w:type="dxa" w:w="110"/>
+              <w:bottom w:type="dxa" w:w="70"/>
+              <w:right w:type="dxa" w:w="110"/>
+            </w:tcMar>
+          </w:tcPr>
+          <w:p>
+            <w:r>
+              <w:rPr>
+                <w:sz w:val="18"/>
+                <w:szCs w:val="18"/>
+              </w:rPr>
+              <w:t xml:space="preserve">Le candidat</w:t>
+            </w:r>
+          </w:p>
+        </w:tc>
+        <w:tc>
+          <w:tcPr>
+            <w:tcW w:type="dxa" w:w="4826"/>
+            <w:tcBorders>
+              <w:top w:val="single" w:color="B7C3D0" w:sz="1"/>
+              <w:left w:val="single" w:color="B7C3D0" w:sz="1"/>
+              <w:bottom w:val="single" w:color="B7C3D0" w:sz="1"/>
+              <w:right w:val="single" w:color="B7C3D0" w:sz="1"/>
+            </w:tcBorders>
+            <w:tcMar>
+              <w:top w:type="dxa" w:w="70"/>
+              <w:left w:type="dxa" w:w="110"/>
+              <w:bottom w:type="dxa" w:w="70"/>
+              <w:right w:type="dxa" w:w="110"/>
+            </w:tcMar>
+          </w:tcPr>
+          <w:p>
+            <w:r>
+              <w:rPr>
+                <w:sz w:val="18"/>
+                <w:szCs w:val="18"/>
+              </w:rPr>
+              <w:t xml:space="preserve">Organisation du travail, suivi du Kanban, levée des obstacles techniques</w:t>
+            </w:r>
+          </w:p>
+        </w:tc>
+      </w:tr>
+      <w:tr>
+        <w:tc>
+          <w:tcPr>
+            <w:tcW w:type="dxa" w:w="2300"/>
+            <w:tcBorders>
+              <w:top w:val="single" w:color="B7C3D0" w:sz="1"/>
+              <w:left w:val="single" w:color="B7C3D0" w:sz="1"/>
+              <w:bottom w:val="single" w:color="B7C3D0" w:sz="1"/>
+              <w:right w:val="single" w:color="B7C3D0" w:sz="1"/>
+            </w:tcBorders>
+            <w:tcMar>
+              <w:top w:type="dxa" w:w="70"/>
+              <w:left w:type="dxa" w:w="110"/>
+              <w:bottom w:type="dxa" w:w="70"/>
+              <w:right w:type="dxa" w:w="110"/>
+            </w:tcMar>
+          </w:tcPr>
+          <w:p>
+            <w:r>
+              <w:rPr>
+                <w:sz w:val="18"/>
+                <w:szCs w:val="18"/>
+              </w:rPr>
+              <w:t xml:space="preserve">Équipe de développement</w:t>
+            </w:r>
+          </w:p>
+        </w:tc>
+        <w:tc>
+          <w:tcPr>
+            <w:tcW w:type="dxa" w:w="1900"/>
+            <w:tcBorders>
+              <w:top w:val="single" w:color="B7C3D0" w:sz="1"/>
+              <w:left w:val="single" w:color="B7C3D0" w:sz="1"/>
+              <w:bottom w:val="single" w:color="B7C3D0" w:sz="1"/>
+              <w:right w:val="single" w:color="B7C3D0" w:sz="1"/>
+            </w:tcBorders>
+            <w:tcMar>
+              <w:top w:type="dxa" w:w="70"/>
+              <w:left w:type="dxa" w:w="110"/>
+              <w:bottom w:type="dxa" w:w="70"/>
+              <w:right w:type="dxa" w:w="110"/>
+            </w:tcMar>
+          </w:tcPr>
+          <w:p>
+            <w:r>
+              <w:rPr>
+                <w:sz w:val="18"/>
+                <w:szCs w:val="18"/>
+              </w:rPr>
+              <w:t xml:space="preserve">Le candidat</w:t>
+            </w:r>
+          </w:p>
+        </w:tc>
+        <w:tc>
+          <w:tcPr>
+            <w:tcW w:type="dxa" w:w="4826"/>
+            <w:tcBorders>
+              <w:top w:val="single" w:color="B7C3D0" w:sz="1"/>
+              <w:left w:val="single" w:color="B7C3D0" w:sz="1"/>
+              <w:bottom w:val="single" w:color="B7C3D0" w:sz="1"/>
+              <w:right w:val="single" w:color="B7C3D0" w:sz="1"/>
+            </w:tcBorders>
+            <w:tcMar>
+              <w:top w:type="dxa" w:w="70"/>
+              <w:left w:type="dxa" w:w="110"/>
+              <w:bottom w:type="dxa" w:w="70"/>
+              <w:right w:type="dxa" w:w="110"/>
+            </w:tcMar>
+          </w:tcPr>
+          <w:p>
+            <w:r>
+              <w:rPr>
+                <w:sz w:val="18"/>
+                <w:szCs w:val="18"/>
+              </w:rPr>
+              <w:t xml:space="preserve">Conception, développement, tests et documentation</w:t>
+            </w:r>
+          </w:p>
+        </w:tc>
+      </w:tr>
+    </w:tbl>
+    <w:p>
+      <w:pPr>
+        <w:spacing w:after="120"/>
+        <w:rPr>
+          <w:b/>
+          <w:bCs/>
+        </w:rPr>
+      </w:pPr>
+      <w:r>
+        <w:rPr>
+          <w:b/>
+          <w:bCs/>
+        </w:rPr>
+        <w:t xml:space="preserve">Adaptation des cérémonies :</w:t>
+      </w:r>
+    </w:p>
+    <w:tbl>
+      <w:tblPr>
+        <w:tblW w:type="dxa" w:w="9026"/>
+        <w:tblBorders>
+          <w:top w:val="single" w:color="auto" w:sz="4"/>
+          <w:left w:val="single" w:color="auto" w:sz="4"/>
+          <w:bottom w:val="single" w:color="auto" w:sz="4"/>
+          <w:right w:val="single" w:color="auto" w:sz="4"/>
+          <w:insideH w:val="single" w:color="auto" w:sz="4"/>
+          <w:insideV w:val="single" w:color="auto" w:sz="4"/>
+        </w:tblBorders>
+      </w:tblPr>
+      <w:tblGrid>
+        <w:gridCol w:w="3300"/>
+        <w:gridCol w:w="5726"/>
+      </w:tblGrid>
+      <w:tr>
+        <w:trPr>
+          <w:tblHeader/>
+        </w:trPr>
+        <w:tc>
+          <w:tcPr>
+            <w:tcW w:type="dxa" w:w="3300"/>
+            <w:tcBorders>
+              <w:top w:val="single" w:color="B7C3D0" w:sz="1"/>
+              <w:left w:val="single" w:color="B7C3D0" w:sz="1"/>
+              <w:bottom w:val="single" w:color="B7C3D0" w:sz="1"/>
+              <w:right w:val="single" w:color="B7C3D0" w:sz="1"/>
+            </w:tcBorders>
+            <w:shd w:fill="0B5394" w:val="clear"/>
+            <w:tcMar>
+              <w:top w:type="dxa" w:w="80"/>
+              <w:left w:type="dxa" w:w="110"/>
+              <w:bottom w:type="dxa" w:w="80"/>
+              <w:right w:type="dxa" w:w="110"/>
+            </w:tcMar>
+          </w:tcPr>
+          <w:p>
+            <w:r>
+              <w:rPr>
+                <w:b/>
+                <w:bCs/>
+                <w:color w:val="FFFFFF"/>
+                <w:sz w:val="19"/>
+                <w:szCs w:val="19"/>
+              </w:rPr>
+              <w:t xml:space="preserve">Cérémonie Scrum (équipe)</w:t>
+            </w:r>
+          </w:p>
+        </w:tc>
+        <w:tc>
+          <w:tcPr>
+            <w:tcW w:type="dxa" w:w="5726"/>
+            <w:tcBorders>
+              <w:top w:val="single" w:color="B7C3D0" w:sz="1"/>
+              <w:left w:val="single" w:color="B7C3D0" w:sz="1"/>
+              <w:bottom w:val="single" w:color="B7C3D0" w:sz="1"/>
+              <w:right w:val="single" w:color="B7C3D0" w:sz="1"/>
+            </w:tcBorders>
+            <w:shd w:fill="0B5394" w:val="clear"/>
+            <w:tcMar>
+              <w:top w:type="dxa" w:w="80"/>
+              <w:left w:type="dxa" w:w="110"/>
+              <w:bottom w:type="dxa" w:w="80"/>
+              <w:right w:type="dxa" w:w="110"/>
+            </w:tcMar>
+          </w:tcPr>
+          <w:p>
+            <w:r>
+              <w:rPr>
+                <w:b/>
+                <w:bCs/>
+                <w:color w:val="FFFFFF"/>
+                <w:sz w:val="19"/>
+                <w:szCs w:val="19"/>
+              </w:rPr>
+              <w:t xml:space="preserve">Adaptation au contexte individuel</w:t>
+            </w:r>
+          </w:p>
+        </w:tc>
+      </w:tr>
+      <w:tr>
+        <w:tc>
+          <w:tcPr>
+            <w:tcW w:type="dxa" w:w="3300"/>
+            <w:tcBorders>
+              <w:top w:val="single" w:color="B7C3D0" w:sz="1"/>
+              <w:left w:val="single" w:color="B7C3D0" w:sz="1"/>
+              <w:bottom w:val="single" w:color="B7C3D0" w:sz="1"/>
+              <w:right w:val="single" w:color="B7C3D0" w:sz="1"/>
+            </w:tcBorders>
+            <w:tcMar>
+              <w:top w:type="dxa" w:w="70"/>
+              <w:left w:type="dxa" w:w="110"/>
+              <w:bottom w:type="dxa" w:w="70"/>
+              <w:right w:type="dxa" w:w="110"/>
+            </w:tcMar>
+          </w:tcPr>
+          <w:p>
+            <w:r>
+              <w:rPr>
+                <w:sz w:val="18"/>
+                <w:szCs w:val="18"/>
+              </w:rPr>
+              <w:t xml:space="preserve">Daily meeting</w:t>
+            </w:r>
+          </w:p>
+        </w:tc>
+        <w:tc>
+          <w:tcPr>
+            <w:tcW w:type="dxa" w:w="5726"/>
+            <w:tcBorders>
+              <w:top w:val="single" w:color="B7C3D0" w:sz="1"/>
+              <w:left w:val="single" w:color="B7C3D0" w:sz="1"/>
+              <w:bottom w:val="single" w:color="B7C3D0" w:sz="1"/>
+              <w:right w:val="single" w:color="B7C3D0" w:sz="1"/>
+            </w:tcBorders>
+            <w:tcMar>
+              <w:top w:type="dxa" w:w="70"/>
+              <w:left w:type="dxa" w:w="110"/>
+              <w:bottom w:type="dxa" w:w="70"/>
+              <w:right w:type="dxa" w:w="110"/>
+            </w:tcMar>
+          </w:tcPr>
+          <w:p>
+            <w:r>
+              <w:rPr>
+                <w:sz w:val="18"/>
+                <w:szCs w:val="18"/>
+              </w:rPr>
+              <w:t xml:space="preserve">Point d'avancement personnel quotidien et mise à jour du tableau Kanban</w:t>
+            </w:r>
+          </w:p>
+        </w:tc>
+      </w:tr>
+      <w:tr>
+        <w:tc>
+          <w:tcPr>
+            <w:tcW w:type="dxa" w:w="3300"/>
+            <w:tcBorders>
+              <w:top w:val="single" w:color="B7C3D0" w:sz="1"/>
+              <w:left w:val="single" w:color="B7C3D0" w:sz="1"/>
+              <w:bottom w:val="single" w:color="B7C3D0" w:sz="1"/>
+              <w:right w:val="single" w:color="B7C3D0" w:sz="1"/>
+            </w:tcBorders>
+            <w:tcMar>
+              <w:top w:type="dxa" w:w="70"/>
+              <w:left w:type="dxa" w:w="110"/>
+              <w:bottom w:type="dxa" w:w="70"/>
+              <w:right w:type="dxa" w:w="110"/>
+            </w:tcMar>
+          </w:tcPr>
+          <w:p>
+            <w:r>
+              <w:rPr>
+                <w:sz w:val="18"/>
+                <w:szCs w:val="18"/>
+              </w:rPr>
+              <w:t xml:space="preserve">Sprint planning</w:t>
+            </w:r>
+          </w:p>
+        </w:tc>
+        <w:tc>
+          <w:tcPr>
+            <w:tcW w:type="dxa" w:w="5726"/>
+            <w:tcBorders>
+              <w:top w:val="single" w:color="B7C3D0" w:sz="1"/>
+              <w:left w:val="single" w:color="B7C3D0" w:sz="1"/>
+              <w:bottom w:val="single" w:color="B7C3D0" w:sz="1"/>
+              <w:right w:val="single" w:color="B7C3D0" w:sz="1"/>
+            </w:tcBorders>
+            <w:tcMar>
+              <w:top w:type="dxa" w:w="70"/>
+              <w:left w:type="dxa" w:w="110"/>
+              <w:bottom w:type="dxa" w:w="70"/>
+              <w:right w:type="dxa" w:w="110"/>
+            </w:tcMar>
+          </w:tcPr>
+          <w:p>
+            <w:r>
+              <w:rPr>
+                <w:sz w:val="18"/>
+                <w:szCs w:val="18"/>
+              </w:rPr>
+              <w:t xml:space="preserve">Sélection des User Stories de l'itération depuis le backlog priorisé</w:t>
+            </w:r>
+          </w:p>
+        </w:tc>
+      </w:tr>
+      <w:tr>
+        <w:tc>
+          <w:tcPr>
+            <w:tcW w:type="dxa" w:w="3300"/>
+            <w:tcBorders>
+              <w:top w:val="single" w:color="B7C3D0" w:sz="1"/>
+              <w:left w:val="single" w:color="B7C3D0" w:sz="1"/>
+              <w:bottom w:val="single" w:color="B7C3D0" w:sz="1"/>
+              <w:right w:val="single" w:color="B7C3D0" w:sz="1"/>
+            </w:tcBorders>
+            <w:tcMar>
+              <w:top w:type="dxa" w:w="70"/>
+              <w:left w:type="dxa" w:w="110"/>
+              <w:bottom w:type="dxa" w:w="70"/>
+              <w:right w:type="dxa" w:w="110"/>
+            </w:tcMar>
+          </w:tcPr>
+          <w:p>
+            <w:r>
+              <w:rPr>
+                <w:sz w:val="18"/>
+                <w:szCs w:val="18"/>
+              </w:rPr>
+              <w:t xml:space="preserve">Sprint review</w:t>
+            </w:r>
+          </w:p>
+        </w:tc>
+        <w:tc>
+          <w:tcPr>
+            <w:tcW w:type="dxa" w:w="5726"/>
+            <w:tcBorders>
+              <w:top w:val="single" w:color="B7C3D0" w:sz="1"/>
+              <w:left w:val="single" w:color="B7C3D0" w:sz="1"/>
+              <w:bottom w:val="single" w:color="B7C3D0" w:sz="1"/>
+              <w:right w:val="single" w:color="B7C3D0" w:sz="1"/>
+            </w:tcBorders>
+            <w:tcMar>
+              <w:top w:type="dxa" w:w="70"/>
+              <w:left w:type="dxa" w:w="110"/>
+              <w:bottom w:type="dxa" w:w="70"/>
+              <w:right w:type="dxa" w:w="110"/>
+            </w:tcMar>
+          </w:tcPr>
+          <w:p>
+            <w:r>
+              <w:rPr>
+                <w:sz w:val="18"/>
+                <w:szCs w:val="18"/>
+              </w:rPr>
+              <w:t xml:space="preserve">Vérification de la « Definition of Done » et démonstration à l'encadrant</w:t>
+            </w:r>
+          </w:p>
+        </w:tc>
+      </w:tr>
+      <w:tr>
+        <w:tc>
+          <w:tcPr>
+            <w:tcW w:type="dxa" w:w="3300"/>
+            <w:tcBorders>
+              <w:top w:val="single" w:color="B7C3D0" w:sz="1"/>
+              <w:left w:val="single" w:color="B7C3D0" w:sz="1"/>
+              <w:bottom w:val="single" w:color="B7C3D0" w:sz="1"/>
+              <w:right w:val="single" w:color="B7C3D0" w:sz="1"/>
+            </w:tcBorders>
+            <w:tcMar>
+              <w:top w:type="dxa" w:w="70"/>
+              <w:left w:type="dxa" w:w="110"/>
+              <w:bottom w:type="dxa" w:w="70"/>
+              <w:right w:type="dxa" w:w="110"/>
+            </w:tcMar>
+          </w:tcPr>
+          <w:p>
+            <w:r>
+              <w:rPr>
+                <w:sz w:val="18"/>
+                <w:szCs w:val="18"/>
+              </w:rPr>
+              <w:t xml:space="preserve">Rétrospective</w:t>
+            </w:r>
+          </w:p>
+        </w:tc>
+        <w:tc>
+          <w:tcPr>
+            <w:tcW w:type="dxa" w:w="5726"/>
+            <w:tcBorders>
+              <w:top w:val="single" w:color="B7C3D0" w:sz="1"/>
+              <w:left w:val="single" w:color="B7C3D0" w:sz="1"/>
+              <w:bottom w:val="single" w:color="B7C3D0" w:sz="1"/>
+              <w:right w:val="single" w:color="B7C3D0" w:sz="1"/>
+            </w:tcBorders>
+            <w:tcMar>
+              <w:top w:type="dxa" w:w="70"/>
+              <w:left w:type="dxa" w:w="110"/>
+              <w:bottom w:type="dxa" w:w="70"/>
+              <w:right w:type="dxa" w:w="110"/>
+            </w:tcMar>
+          </w:tcPr>
+          <w:p>
+            <w:r>
+              <w:rPr>
+                <w:sz w:val="18"/>
+                <w:szCs w:val="18"/>
+              </w:rPr>
+              <w:t xml:space="preserve">Bilan personnel écrit en fin de projet (voir ci-dessous)</w:t>
+            </w:r>
+          </w:p>
+        </w:tc>
+      </w:tr>
+    </w:tbl>
+    <w:p>
+      <w:pPr>
+        <w:spacing w:after="120"/>
+        <w:rPr>
+          <w:b/>
+          <w:bCs/>
+        </w:rPr>
+      </w:pPr>
+      <w:r>
+        <w:rPr>
+          <w:b/>
+          <w:bCs/>
+        </w:rPr>
+        <w:t xml:space="preserve">Definition of Done (définition du « terminé ») — une User Story est considérée comme terminée lorsque :</w:t>
+      </w:r>
+    </w:p>
+    <w:p>
+      <w:pPr>
+        <w:pStyle w:val="ListParagraph"/>
+        <w:numPr>
+          <w:ilvl w:val="0"/>
+          <w:numId w:val="3"/>
+        </w:numPr>
+        <w:spacing w:after="60"/>
+      </w:pPr>
+      <w:r>
+        <w:t xml:space="preserve">le code de la fonctionnalité est écrit et fonctionnel ;</w:t>
+      </w:r>
+    </w:p>
+    <w:p>
+      <w:pPr>
+        <w:pStyle w:val="ListParagraph"/>
+        <w:numPr>
+          <w:ilvl w:val="0"/>
+          <w:numId w:val="3"/>
+        </w:numPr>
+        <w:spacing w:after="60"/>
+      </w:pPr>
+      <w:r>
+        <w:t xml:space="preserve">il est couvert par des tests automatisés qui passent ;</w:t>
+      </w:r>
+    </w:p>
+    <w:p>
+      <w:pPr>
+        <w:pStyle w:val="ListParagraph"/>
+        <w:numPr>
+          <w:ilvl w:val="0"/>
+          <w:numId w:val="3"/>
+        </w:numPr>
+        <w:spacing w:after="60"/>
+      </w:pPr>
+      <w:r>
+        <w:t xml:space="preserve">il est documenté (commentaires utiles, documentation mise à jour si nécessaire) ;</w:t>
+      </w:r>
+    </w:p>
+    <w:p>
+      <w:pPr>
+        <w:pStyle w:val="ListParagraph"/>
+        <w:numPr>
+          <w:ilvl w:val="0"/>
+          <w:numId w:val="3"/>
+        </w:numPr>
+        <w:spacing w:after="60"/>
+      </w:pPr>
+      <w:r>
+        <w:t xml:space="preserve">il est versionné sur sa branche et intégré après succès de l'intégration continue.</w:t>
+      </w:r>
+    </w:p>
+    <w:p>
+      <w:pPr>
+        <w:spacing w:after="120"/>
+        <w:rPr>
+          <w:b/>
+          <w:bCs/>
+        </w:rPr>
+      </w:pPr>
+      <w:r>
+        <w:rPr>
+          <w:b/>
+          <w:bCs/>
+        </w:rPr>
+        <w:t xml:space="preserve">Rétrospective de fin de projet :</w:t>
+      </w:r>
+    </w:p>
+    <w:tbl>
+      <w:tblPr>
+        <w:tblW w:type="dxa" w:w="9026"/>
+        <w:tblBorders>
+          <w:top w:val="single" w:color="auto" w:sz="4"/>
+          <w:left w:val="single" w:color="auto" w:sz="4"/>
+          <w:bottom w:val="single" w:color="auto" w:sz="4"/>
+          <w:right w:val="single" w:color="auto" w:sz="4"/>
+          <w:insideH w:val="single" w:color="auto" w:sz="4"/>
+          <w:insideV w:val="single" w:color="auto" w:sz="4"/>
+        </w:tblBorders>
+      </w:tblPr>
+      <w:tblGrid>
+        <w:gridCol w:w="3008"/>
+        <w:gridCol w:w="3008"/>
+        <w:gridCol w:w="3010"/>
+      </w:tblGrid>
+      <w:tr>
+        <w:trPr>
+          <w:tblHeader/>
+        </w:trPr>
+        <w:tc>
+          <w:tcPr>
+            <w:tcW w:type="dxa" w:w="3008"/>
+            <w:tcBorders>
+              <w:top w:val="single" w:color="B7C3D0" w:sz="1"/>
+              <w:left w:val="single" w:color="B7C3D0" w:sz="1"/>
+              <w:bottom w:val="single" w:color="B7C3D0" w:sz="1"/>
+              <w:right w:val="single" w:color="B7C3D0" w:sz="1"/>
+            </w:tcBorders>
+            <w:shd w:fill="0B5394" w:val="clear"/>
+            <w:tcMar>
+              <w:top w:type="dxa" w:w="80"/>
+              <w:left w:type="dxa" w:w="110"/>
+              <w:bottom w:type="dxa" w:w="80"/>
+              <w:right w:type="dxa" w:w="110"/>
+            </w:tcMar>
+          </w:tcPr>
+          <w:p>
+            <w:r>
+              <w:rPr>
+                <w:b/>
+                <w:bCs/>
+                <w:color w:val="FFFFFF"/>
+                <w:sz w:val="19"/>
+                <w:szCs w:val="19"/>
+              </w:rPr>
+              <w:t xml:space="preserve">Ce qui a bien fonctionné</w:t>
+            </w:r>
+          </w:p>
+        </w:tc>
+        <w:tc>
+          <w:tcPr>
+            <w:tcW w:type="dxa" w:w="3008"/>
+            <w:tcBorders>
+              <w:top w:val="single" w:color="B7C3D0" w:sz="1"/>
+              <w:left w:val="single" w:color="B7C3D0" w:sz="1"/>
+              <w:bottom w:val="single" w:color="B7C3D0" w:sz="1"/>
+              <w:right w:val="single" w:color="B7C3D0" w:sz="1"/>
+            </w:tcBorders>
+            <w:shd w:fill="0B5394" w:val="clear"/>
+            <w:tcMar>
+              <w:top w:type="dxa" w:w="80"/>
+              <w:left w:type="dxa" w:w="110"/>
+              <w:bottom w:type="dxa" w:w="80"/>
+              <w:right w:type="dxa" w:w="110"/>
+            </w:tcMar>
+          </w:tcPr>
+          <w:p>
+            <w:r>
+              <w:rPr>
+                <w:b/>
+                <w:bCs/>
+                <w:color w:val="FFFFFF"/>
+                <w:sz w:val="19"/>
+                <w:szCs w:val="19"/>
+              </w:rPr>
+              <w:t xml:space="preserve">Difficultés rencontrées</w:t>
+            </w:r>
+          </w:p>
+        </w:tc>
+        <w:tc>
+          <w:tcPr>
+            <w:tcW w:type="dxa" w:w="3010"/>
+            <w:tcBorders>
+              <w:top w:val="single" w:color="B7C3D0" w:sz="1"/>
+              <w:left w:val="single" w:color="B7C3D0" w:sz="1"/>
+              <w:bottom w:val="single" w:color="B7C3D0" w:sz="1"/>
+              <w:right w:val="single" w:color="B7C3D0" w:sz="1"/>
+            </w:tcBorders>
+            <w:shd w:fill="0B5394" w:val="clear"/>
+            <w:tcMar>
+              <w:top w:type="dxa" w:w="80"/>
+              <w:left w:type="dxa" w:w="110"/>
+              <w:bottom w:type="dxa" w:w="80"/>
+              <w:right w:type="dxa" w:w="110"/>
+            </w:tcMar>
+          </w:tcPr>
+          <w:p>
+            <w:r>
+              <w:rPr>
+                <w:b/>
+                <w:bCs/>
+                <w:color w:val="FFFFFF"/>
+                <w:sz w:val="19"/>
+                <w:szCs w:val="19"/>
+              </w:rPr>
+              <w:t xml:space="preserve">Axes d'amélioration</w:t>
+            </w:r>
+          </w:p>
+        </w:tc>
+      </w:tr>
+      <w:tr>
+        <w:tc>
+          <w:tcPr>
+            <w:tcW w:type="dxa" w:w="3008"/>
+            <w:tcBorders>
+              <w:top w:val="single" w:color="B7C3D0" w:sz="1"/>
+              <w:left w:val="single" w:color="B7C3D0" w:sz="1"/>
+              <w:bottom w:val="single" w:color="B7C3D0" w:sz="1"/>
+              <w:right w:val="single" w:color="B7C3D0" w:sz="1"/>
+            </w:tcBorders>
+            <w:tcMar>
+              <w:top w:type="dxa" w:w="70"/>
+              <w:left w:type="dxa" w:w="110"/>
+              <w:bottom w:type="dxa" w:w="70"/>
+              <w:right w:type="dxa" w:w="110"/>
+            </w:tcMar>
+          </w:tcPr>
+          <w:p>
+            <w:r>
+              <w:rPr>
+                <w:sz w:val="18"/>
+                <w:szCs w:val="18"/>
+              </w:rPr>
+              <w:t xml:space="preserve">Découpage en User Stories testées ; la priorisation MoSCoW a permis de tenir le périmètre dans les délais.</w:t>
+            </w:r>
+          </w:p>
+        </w:tc>
+        <w:tc>
+          <w:tcPr>
+            <w:tcW w:type="dxa" w:w="3008"/>
+            <w:tcBorders>
+              <w:top w:val="single" w:color="B7C3D0" w:sz="1"/>
+              <w:left w:val="single" w:color="B7C3D0" w:sz="1"/>
+              <w:bottom w:val="single" w:color="B7C3D0" w:sz="1"/>
+              <w:right w:val="single" w:color="B7C3D0" w:sz="1"/>
+            </w:tcBorders>
+            <w:tcMar>
+              <w:top w:type="dxa" w:w="70"/>
+              <w:left w:type="dxa" w:w="110"/>
+              <w:bottom w:type="dxa" w:w="70"/>
+              <w:right w:type="dxa" w:w="110"/>
+            </w:tcMar>
+          </w:tcPr>
+          <w:p>
+            <w:r>
+              <w:rPr>
+                <w:sz w:val="18"/>
+                <w:szCs w:val="18"/>
+              </w:rPr>
+              <w:t xml:space="preserve">Incompatibilités de versions de dépendances ; cohérence des statuts de demande à garantir.</w:t>
+            </w:r>
+          </w:p>
+        </w:tc>
+        <w:tc>
+          <w:tcPr>
+            <w:tcW w:type="dxa" w:w="3010"/>
+            <w:tcBorders>
+              <w:top w:val="single" w:color="B7C3D0" w:sz="1"/>
+              <w:left w:val="single" w:color="B7C3D0" w:sz="1"/>
+              <w:bottom w:val="single" w:color="B7C3D0" w:sz="1"/>
+              <w:right w:val="single" w:color="B7C3D0" w:sz="1"/>
+            </w:tcBorders>
+            <w:tcMar>
+              <w:top w:type="dxa" w:w="70"/>
+              <w:left w:type="dxa" w:w="110"/>
+              <w:bottom w:type="dxa" w:w="70"/>
+              <w:right w:type="dxa" w:w="110"/>
+            </w:tcMar>
+          </w:tcPr>
+          <w:p>
+            <w:r>
+              <w:rPr>
+                <w:sz w:val="18"/>
+                <w:szCs w:val="18"/>
+              </w:rPr>
+              <w:t xml:space="preserve">Mettre en place le déploiement plus tôt ; ajouter des tests end-to-end (Playwright).</w:t>
+            </w:r>
+          </w:p>
+        </w:tc>
+      </w:tr>
+    </w:tbl>
     <w:p>
       <w:pPr>
         <w:pStyle w:val="Heading2"/>

</xml_diff>

<commit_message>
Mémoire : ajout de la capture des tests (Fig.18) — toutes les illustrations en place
</commit_message>
<xml_diff>
--- a/livrables/Dossier_Projet_CongesFlow.docx
+++ b/livrables/Dossier_Projet_CongesFlow.docx
@@ -20263,40 +20263,77 @@
           <w:tcPr>
             <w:tcW w:type="dxa" w:w="9026"/>
             <w:tcBorders>
-              <w:top w:val="dashed" w:color="0B5394" w:sz="2"/>
-              <w:left w:val="dashed" w:color="0B5394" w:sz="2"/>
-              <w:bottom w:val="dashed" w:color="0B5394" w:sz="2"/>
-              <w:right w:val="dashed" w:color="0B5394" w:sz="2"/>
-            </w:tcBorders>
-            <w:shd w:fill="EEF3FC" w:val="clear"/>
-            <w:tcMar>
-              <w:top w:type="dxa" w:w="160"/>
-              <w:left w:type="dxa" w:w="160"/>
-              <w:bottom w:type="dxa" w:w="160"/>
-              <w:right w:type="dxa" w:w="160"/>
-            </w:tcMar>
-          </w:tcPr>
-          <w:p>
-            <w:pPr>
-              <w:spacing w:after="40"/>
-            </w:pPr>
-            <w:r>
-              <w:rPr>
-                <w:b/>
-                <w:bCs/>
-                <w:color w:val="0B5394"/>
-              </w:rPr>
-              <w:t xml:space="preserve">📷  CAPTURE D'ÉCRAN À INSÉRER ICI</w:t>
-            </w:r>
-          </w:p>
-          <w:p>
+              <w:top w:val="single" w:color="B7C3D0" w:sz="1"/>
+              <w:left w:val="single" w:color="B7C3D0" w:sz="1"/>
+              <w:bottom w:val="single" w:color="B7C3D0" w:sz="1"/>
+              <w:right w:val="single" w:color="B7C3D0" w:sz="1"/>
+            </w:tcBorders>
+            <w:tcMar>
+              <w:top w:type="dxa" w:w="120"/>
+              <w:left w:type="dxa" w:w="120"/>
+              <w:bottom w:type="dxa" w:w="120"/>
+              <w:right w:type="dxa" w:w="120"/>
+            </w:tcMar>
+          </w:tcPr>
+          <w:p>
+            <w:pPr>
+              <w:spacing w:after="80"/>
+              <w:jc w:val="center"/>
+            </w:pPr>
+            <w:r>
+              <w:drawing>
+                <wp:inline distT="0" distB="0" distL="0" distR="0">
+                  <wp:extent cx="5334000" cy="447675"/>
+                  <wp:effectExtent t="0" r="0" b="0" l="0"/>
+                  <wp:docPr id="1" name="fig18-tests.png" descr="Sortie de l'exécution des tests (pytest) — 26 tests au vert" title="Fig.18"/>
+                  <wp:cNvGraphicFramePr>
+                    <a:graphicFrameLocks xmlns:a="http://schemas.openxmlformats.org/drawingml/2006/main" noChangeAspect="1"/>
+                  </wp:cNvGraphicFramePr>
+                  <a:graphic xmlns:a="http://schemas.openxmlformats.org/drawingml/2006/main">
+                    <a:graphicData uri="http://schemas.openxmlformats.org/drawingml/2006/picture">
+                      <pic:pic xmlns:pic="http://schemas.openxmlformats.org/drawingml/2006/picture">
+                        <pic:nvPicPr>
+                          <pic:cNvPr id="0" name="" descr=""/>
+                          <pic:cNvPicPr>
+                            <a:picLocks noChangeAspect="1" noChangeArrowheads="1"/>
+                          </pic:cNvPicPr>
+                        </pic:nvPicPr>
+                        <pic:blipFill>
+                          <a:blip r:embed="rId24" cstate="none"/>
+                          <a:srcRect/>
+                          <a:stretch>
+                            <a:fillRect/>
+                          </a:stretch>
+                        </pic:blipFill>
+                        <pic:spPr bwMode="auto">
+                          <a:xfrm>
+                            <a:off x="0" y="0"/>
+                            <a:ext cx="5334000" cy="447675"/>
+                          </a:xfrm>
+                          <a:prstGeom prst="rect">
+                            <a:avLst/>
+                          </a:prstGeom>
+                        </pic:spPr>
+                      </pic:pic>
+                    </a:graphicData>
+                  </a:graphic>
+                </wp:inline>
+              </w:drawing>
+            </w:r>
+          </w:p>
+          <w:p>
+            <w:pPr>
+              <w:jc w:val="center"/>
+            </w:pPr>
             <w:r>
               <w:rPr>
                 <w:i/>
                 <w:iCs/>
                 <w:color w:val="44505F"/>
-              </w:rPr>
-              <w:t xml:space="preserve">Fig.18 — Sortie de l'exécution des tests (pytest et Vitest).</w:t>
+                <w:sz w:val="18"/>
+                <w:szCs w:val="18"/>
+              </w:rPr>
+              <w:t xml:space="preserve">Fig.18 — Sortie de l'exécution des tests (pytest) — 26 tests au vert</w:t>
             </w:r>
           </w:p>
         </w:tc>
@@ -23097,7 +23134,7 @@
                           </pic:cNvPicPr>
                         </pic:nvPicPr>
                         <pic:blipFill>
-                          <a:blip r:embed="rId24" cstate="none"/>
+                          <a:blip r:embed="rId25" cstate="none"/>
                           <a:srcRect/>
                           <a:stretch>
                             <a:fillRect/>

</xml_diff>

<commit_message>
Mémoire : titres de chapitres en bandeau coloré (plus visibles) — retour encadrant
</commit_message>
<xml_diff>
--- a/livrables/Dossier_Projet_CongesFlow.docx
+++ b/livrables/Dossier_Projet_CongesFlow.docx
@@ -24925,17 +24925,18 @@
     <w:qFormat/>
     <w:pPr>
       <w:pBdr>
-        <w:bottom w:val="single" w:color="0B5394" w:sz="6" w:space="4"/>
+        <w:bottom w:val="single" w:color="07386A" w:sz="18" w:space="6"/>
       </w:pBdr>
-      <w:spacing w:after="160" w:before="280"/>
+      <w:shd w:fill="0B5394" w:val="clear"/>
+      <w:spacing w:after="200" w:before="340"/>
       <w:outlineLvl w:val="0"/>
     </w:pPr>
     <w:rPr>
       <w:b/>
       <w:bCs/>
-      <w:color w:val="1B2A4A"/>
-      <w:sz w:val="30"/>
-      <w:szCs w:val="30"/>
+      <w:color w:val="FFFFFF"/>
+      <w:sz w:val="32"/>
+      <w:szCs w:val="32"/>
     </w:rPr>
   </w:style>
   <w:style w:type="paragraph" w:styleId="Heading2">
@@ -24944,6 +24945,9 @@
     <w:next w:val="Normal"/>
     <w:qFormat/>
     <w:pPr>
+      <w:pBdr>
+        <w:bottom w:val="single" w:color="9DB8DA" w:sz="6" w:space="3"/>
+      </w:pBdr>
       <w:spacing w:after="120" w:before="220"/>
       <w:outlineLvl w:val="1"/>
     </w:pPr>

</xml_diff>